<commit_message>
Update Database Lab Project Documentation 2025.docx
add GitHub link in Documentation
</commit_message>
<xml_diff>
--- a/Database Lab Project Documentation 2025.docx
+++ b/Database Lab Project Documentation 2025.docx
@@ -7017,6 +7017,7 @@
         <w:rPr>
           <w:rFonts w:eastAsia="Times New Roman" w:cstheme="minorHAnsi"/>
           <w:b/>
+          <w:noProof/>
           <w:sz w:val="24"/>
           <w:szCs w:val="24"/>
         </w:rPr>
@@ -7096,6 +7097,7 @@
         <w:rPr>
           <w:rFonts w:eastAsia="Times New Roman" w:cstheme="minorHAnsi"/>
           <w:b/>
+          <w:noProof/>
           <w:sz w:val="24"/>
           <w:szCs w:val="24"/>
         </w:rPr>
@@ -7175,6 +7177,7 @@
         <w:rPr>
           <w:rFonts w:eastAsia="Times New Roman" w:cstheme="minorHAnsi"/>
           <w:b/>
+          <w:noProof/>
           <w:sz w:val="24"/>
           <w:szCs w:val="24"/>
         </w:rPr>
@@ -7230,6 +7233,7 @@
         <w:rPr>
           <w:rFonts w:eastAsia="Times New Roman" w:cstheme="minorHAnsi"/>
           <w:b/>
+          <w:noProof/>
           <w:sz w:val="24"/>
           <w:szCs w:val="24"/>
         </w:rPr>
@@ -7310,6 +7314,7 @@
         <w:rPr>
           <w:rFonts w:eastAsia="Times New Roman" w:cstheme="minorHAnsi"/>
           <w:b/>
+          <w:noProof/>
           <w:sz w:val="24"/>
           <w:szCs w:val="24"/>
         </w:rPr>
@@ -7386,6 +7391,7 @@
       <w:r>
         <w:rPr>
           <w:rFonts w:eastAsia="Times New Roman" w:cstheme="minorHAnsi"/>
+          <w:noProof/>
           <w:sz w:val="24"/>
           <w:szCs w:val="24"/>
         </w:rPr>
@@ -7654,8 +7660,6 @@
         </w:rPr>
         <w:t xml:space="preserve">Our Volunteer Management System successfully implements a complete solution for managing volunteers and events. </w:t>
       </w:r>
-      <w:bookmarkStart w:id="0" w:name="_GoBack"/>
-      <w:bookmarkEnd w:id="0"/>
     </w:p>
     <w:p>
       <w:pPr>
@@ -7866,30 +7870,35 @@
     </w:p>
     <w:p>
       <w:pPr>
-        <w:spacing w:beforeAutospacing="1" w:after="100" w:afterAutospacing="1" w:line="240" w:lineRule="auto"/>
-        <w:rPr>
-          <w:rFonts w:eastAsia="Times New Roman" w:cstheme="minorHAnsi"/>
-          <w:sz w:val="24"/>
-          <w:szCs w:val="24"/>
-        </w:rPr>
-      </w:pPr>
-      <w:r>
-        <w:rPr>
-          <w:rFonts w:eastAsia="Times New Roman" w:cstheme="minorHAnsi"/>
-          <w:i/>
-          <w:iCs/>
-          <w:sz w:val="24"/>
-          <w:szCs w:val="24"/>
-        </w:rPr>
-        <w:t>Paste your working GitHub repo URL here.</w:t>
-      </w:r>
-    </w:p>
-    <w:p>
-      <w:pPr>
         <w:rPr>
           <w:rFonts w:cstheme="minorHAnsi"/>
         </w:rPr>
       </w:pPr>
+      <w:hyperlink r:id="rId12" w:history="1">
+        <w:r>
+          <w:rPr>
+            <w:rStyle w:val="Hyperlink"/>
+            <w:rFonts w:cstheme="minorHAnsi"/>
+          </w:rPr>
+          <w:t>https://github.com/Hammadarshad026/Voln</w:t>
+        </w:r>
+        <w:bookmarkStart w:id="0" w:name="_GoBack"/>
+        <w:bookmarkEnd w:id="0"/>
+        <w:r>
+          <w:rPr>
+            <w:rStyle w:val="Hyperlink"/>
+            <w:rFonts w:cstheme="minorHAnsi"/>
+          </w:rPr>
+          <w:t>t</w:t>
+        </w:r>
+        <w:r>
+          <w:rPr>
+            <w:rStyle w:val="Hyperlink"/>
+            <w:rFonts w:cstheme="minorHAnsi"/>
+          </w:rPr>
+          <w:t>eer_mangent_sysytem</w:t>
+        </w:r>
+      </w:hyperlink>
     </w:p>
     <w:sectPr>
       <w:pgSz w:w="12240" w:h="15840"/>
@@ -10653,6 +10662,7 @@
   <w:style w:type="character" w:default="1" w:styleId="DefaultParagraphFont">
     <w:name w:val="Default Paragraph Font"/>
     <w:uiPriority w:val="1"/>
+    <w:semiHidden/>
     <w:unhideWhenUsed/>
   </w:style>
   <w:style w:type="table" w:default="1" w:styleId="TableNormal">
@@ -10814,6 +10824,17 @@
       <w:color w:val="1F4D78" w:themeColor="accent1" w:themeShade="7F"/>
       <w:sz w:val="24"/>
       <w:szCs w:val="24"/>
+    </w:rPr>
+  </w:style>
+  <w:style w:type="character" w:styleId="Hyperlink">
+    <w:name w:val="Hyperlink"/>
+    <w:basedOn w:val="DefaultParagraphFont"/>
+    <w:uiPriority w:val="99"/>
+    <w:unhideWhenUsed/>
+    <w:rsid w:val="00893D8E"/>
+    <w:rPr>
+      <w:color w:val="0563C1" w:themeColor="hyperlink"/>
+      <w:u w:val="single"/>
     </w:rPr>
   </w:style>
 </w:styles>

</xml_diff>